<commit_message>
Deepen listening lessons and replace repetitive panels with topic-specific diagrams
Co-authored-by: arena-agent <297053741+arena-agent@users.noreply.github.com>
</commit_message>
<xml_diff>
--- a/Master-Speaking-Student-Practice-Pack.docx
+++ b/Master-Speaking-Student-Practice-Pack.docx
@@ -389,6 +389,24 @@
       </w:r>
     </w:p>
     <w:p>
+      <w:pPr>
+        <w:pStyle w:val="Heading2"/>
+      </w:pPr>
+      <w:r>
+        <w:t>Listen more closely — discuss after checking the details</w:t>
+      </w:r>
+    </w:p>
+    <w:p>
+      <w:r>
+        <w:t>Why might the member’s complaint be reasonable, even though clarification helped?</w:t>
+      </w:r>
+    </w:p>
+    <w:p>
+      <w:r>
+        <w:t>What is the difference between clarifying information and agreeing on an action in this account?</w:t>
+      </w:r>
+    </w:p>
+    <w:p>
       <w:r>
         <w:t>Partner check: Which answer are you least certain about? Say what you need to hear again.</w:t>
       </w:r>
@@ -754,6 +772,24 @@
       </w:r>
     </w:p>
     <w:p>
+      <w:pPr>
+        <w:pStyle w:val="Heading2"/>
+      </w:pPr>
+      <w:r>
+        <w:t>Listen more closely — discuss after checking the details</w:t>
+      </w:r>
+    </w:p>
+    <w:p>
+      <w:r>
+        <w:t>Why does the speaker reject word count as the only measure of progress?</w:t>
+      </w:r>
+    </w:p>
+    <w:p>
+      <w:r>
+        <w:t>What can the two attempts show, and what can they not establish?</w:t>
+      </w:r>
+    </w:p>
+    <w:p>
       <w:r>
         <w:t>Partner check: Which answer are you least certain about? Say what you need to hear again.</w:t>
       </w:r>
@@ -1119,6 +1155,24 @@
       </w:r>
     </w:p>
     <w:p>
+      <w:pPr>
+        <w:pStyle w:val="Heading2"/>
+      </w:pPr>
+      <w:r>
+        <w:t>Listen more closely — discuss after checking the details</w:t>
+      </w:r>
+    </w:p>
+    <w:p>
+      <w:r>
+        <w:t>What was the weakness in the narrator’s first judgment about Kareem?</w:t>
+      </w:r>
+    </w:p>
+    <w:p>
+      <w:r>
+        <w:t>How does the later disagreement distinguish understanding from agreement?</w:t>
+      </w:r>
+    </w:p>
+    <w:p>
       <w:r>
         <w:t>Partner check: Which answer are you least certain about? Say what you need to hear again.</w:t>
       </w:r>
@@ -1484,6 +1538,24 @@
       </w:r>
     </w:p>
     <w:p>
+      <w:pPr>
+        <w:pStyle w:val="Heading2"/>
+      </w:pPr>
+      <w:r>
+        <w:t>Listen more closely — discuss after checking the details</w:t>
+      </w:r>
+    </w:p>
+    <w:p>
+      <w:r>
+        <w:t>Why is the final choice not evidence that one kind of spending always brings more happiness?</w:t>
+      </w:r>
+    </w:p>
+    <w:p>
+      <w:r>
+        <w:t>What concern does inviting new members to help plan the conversation address?</w:t>
+      </w:r>
+    </w:p>
+    <w:p>
       <w:r>
         <w:t>Partner check: Which answer are you least certain about? Say what you need to hear again.</w:t>
       </w:r>
@@ -1849,6 +1921,24 @@
       </w:r>
     </w:p>
     <w:p>
+      <w:pPr>
+        <w:pStyle w:val="Heading2"/>
+      </w:pPr>
+      <w:r>
+        <w:t>Listen more closely — discuss after checking the details</w:t>
+      </w:r>
+    </w:p>
+    <w:p>
+      <w:r>
+        <w:t>What useful contribution did the tool make, and what did that contribution not establish?</w:t>
+      </w:r>
+    </w:p>
+    <w:p>
+      <w:r>
+        <w:t>Why might an apparently polished answer require particular care?</w:t>
+      </w:r>
+    </w:p>
+    <w:p>
       <w:r>
         <w:t>Partner check: Which answer are you least certain about? Say what you need to hear again.</w:t>
       </w:r>
@@ -2214,6 +2304,24 @@
       </w:r>
     </w:p>
     <w:p>
+      <w:pPr>
+        <w:pStyle w:val="Heading2"/>
+      </w:pPr>
+      <w:r>
+        <w:t>Listen more closely — discuss after checking the details</w:t>
+      </w:r>
+    </w:p>
+    <w:p>
+      <w:r>
+        <w:t>Why did the same monthly schedule initially have different meanings for the two friends?</w:t>
+      </w:r>
+    </w:p>
+    <w:p>
+      <w:r>
+        <w:t>What change in their conversation helped them move beyond blame?</w:t>
+      </w:r>
+    </w:p>
+    <w:p>
       <w:r>
         <w:t>Partner check: Which answer are you least certain about? Say what you need to hear again.</w:t>
       </w:r>
@@ -2579,6 +2687,24 @@
       </w:r>
     </w:p>
     <w:p>
+      <w:pPr>
+        <w:pStyle w:val="Heading2"/>
+      </w:pPr>
+      <w:r>
+        <w:t>Listen more closely — discuss after checking the details</w:t>
+      </w:r>
+    </w:p>
+    <w:p>
+      <w:r>
+        <w:t>Why would counting orders alone give an incomplete picture of the trial?</w:t>
+      </w:r>
+    </w:p>
+    <w:p>
+      <w:r>
+        <w:t>What would make consultation meaningful rather than merely symbolic?</w:t>
+      </w:r>
+    </w:p>
+    <w:p>
       <w:r>
         <w:t>Partner check: Which answer are you least certain about? Say what you need to hear again.</w:t>
       </w:r>
@@ -2941,6 +3067,24 @@
     <w:p>
       <w:r>
         <w:t>_______________________________________________________________</w:t>
+      </w:r>
+    </w:p>
+    <w:p>
+      <w:pPr>
+        <w:pStyle w:val="Heading2"/>
+      </w:pPr>
+      <w:r>
+        <w:t>Listen more closely — discuss after checking the details</w:t>
+      </w:r>
+    </w:p>
+    <w:p>
+      <w:r>
+        <w:t>Why was knowing the individual words insufficient in the misunderstanding?</w:t>
+      </w:r>
+    </w:p>
+    <w:p>
+      <w:r>
+        <w:t>What distinction does the ending make between shared communication and uniformity?</w:t>
       </w:r>
     </w:p>
     <w:p>

</xml_diff>